<commit_message>
Addressing first round of ethics board comments.
</commit_message>
<xml_diff>
--- a/Ethics/HPRC Protocol Form - July 2024.docx
+++ b/Ethics/HPRC Protocol Form - July 2024.docx
@@ -1,6 +1,6 @@
 
 <file path=word/document.xml><?xml version="1.0" encoding="utf-8"?>
-<w:document xmlns:wpc="http://schemas.microsoft.com/office/word/2010/wordprocessingCanvas" xmlns:cx="http://schemas.microsoft.com/office/drawing/2014/chartex" xmlns:cx1="http://schemas.microsoft.com/office/drawing/2015/9/8/chartex" xmlns:cx2="http://schemas.microsoft.com/office/drawing/2015/10/21/chartex" xmlns:cx3="http://schemas.microsoft.com/office/drawing/2016/5/9/chartex" xmlns:cx4="http://schemas.microsoft.com/office/drawing/2016/5/10/chartex" xmlns:cx5="http://schemas.microsoft.com/office/drawing/2016/5/11/chartex" xmlns:cx6="http://schemas.microsoft.com/office/drawing/2016/5/12/chartex" xmlns:cx7="http://schemas.microsoft.com/office/drawing/2016/5/13/chartex" xmlns:cx8="http://schemas.microsoft.com/office/drawing/2016/5/14/chartex" xmlns:mc="http://schemas.openxmlformats.org/markup-compatibility/2006" xmlns:aink="http://schemas.microsoft.com/office/drawing/2016/ink" xmlns:am3d="http://schemas.microsoft.com/office/drawing/2017/model3d" xmlns:o="urn:schemas-microsoft-com:office:office" xmlns:oel="http://schemas.microsoft.com/office/2019/extlst" xmlns:r="http://schemas.openxmlformats.org/officeDocument/2006/relationships" xmlns:m="http://schemas.openxmlformats.org/officeDocument/2006/math" xmlns:v="urn:schemas-microsoft-com:vml" xmlns:wp14="http://schemas.microsoft.com/office/word/2010/wordprocessingDrawing" xmlns:wp="http://schemas.openxmlformats.org/drawingml/2006/wordprocessingDrawing" xmlns:w10="urn:schemas-microsoft-com:office:word" xmlns:w="http://schemas.openxmlformats.org/wordprocessingml/2006/main" xmlns:w14="http://schemas.microsoft.com/office/word/2010/wordml" xmlns:w15="http://schemas.microsoft.com/office/word/2012/wordml" xmlns:w16cex="http://schemas.microsoft.com/office/word/2018/wordml/cex" xmlns:w16cid="http://schemas.microsoft.com/office/word/2016/wordml/cid" xmlns:w16="http://schemas.microsoft.com/office/word/2018/wordml" xmlns:w16du="http://schemas.microsoft.com/office/word/2023/wordml/word16du" xmlns:w16sdtdh="http://schemas.microsoft.com/office/word/2020/wordml/sdtdatahash" xmlns:w16se="http://schemas.microsoft.com/office/word/2015/wordml/symex" xmlns:wpg="http://schemas.microsoft.com/office/word/2010/wordprocessingGroup" xmlns:wpi="http://schemas.microsoft.com/office/word/2010/wordprocessingInk" xmlns:wne="http://schemas.microsoft.com/office/word/2006/wordml" xmlns:wps="http://schemas.microsoft.com/office/word/2010/wordprocessingShape" mc:Ignorable="w14 w15 w16se w16cid w16 w16cex w16sdtdh w16du wp14">
+<w:document xmlns:wpc="http://schemas.microsoft.com/office/word/2010/wordprocessingCanvas" xmlns:cx="http://schemas.microsoft.com/office/drawing/2014/chartex" xmlns:cx1="http://schemas.microsoft.com/office/drawing/2015/9/8/chartex" xmlns:cx2="http://schemas.microsoft.com/office/drawing/2015/10/21/chartex" xmlns:cx3="http://schemas.microsoft.com/office/drawing/2016/5/9/chartex" xmlns:cx4="http://schemas.microsoft.com/office/drawing/2016/5/10/chartex" xmlns:cx5="http://schemas.microsoft.com/office/drawing/2016/5/11/chartex" xmlns:cx6="http://schemas.microsoft.com/office/drawing/2016/5/12/chartex" xmlns:cx7="http://schemas.microsoft.com/office/drawing/2016/5/13/chartex" xmlns:cx8="http://schemas.microsoft.com/office/drawing/2016/5/14/chartex" xmlns:mc="http://schemas.openxmlformats.org/markup-compatibility/2006" xmlns:aink="http://schemas.microsoft.com/office/drawing/2016/ink" xmlns:am3d="http://schemas.microsoft.com/office/drawing/2017/model3d" xmlns:o="urn:schemas-microsoft-com:office:office" xmlns:oel="http://schemas.microsoft.com/office/2019/extlst" xmlns:r="http://schemas.openxmlformats.org/officeDocument/2006/relationships" xmlns:m="http://schemas.openxmlformats.org/officeDocument/2006/math" xmlns:v="urn:schemas-microsoft-com:vml" xmlns:wp14="http://schemas.microsoft.com/office/word/2010/wordprocessingDrawing" xmlns:wp="http://schemas.openxmlformats.org/drawingml/2006/wordprocessingDrawing" xmlns:w10="urn:schemas-microsoft-com:office:word" xmlns:w="http://schemas.openxmlformats.org/wordprocessingml/2006/main" xmlns:w14="http://schemas.microsoft.com/office/word/2010/wordml" xmlns:w15="http://schemas.microsoft.com/office/word/2012/wordml" xmlns:w16cex="http://schemas.microsoft.com/office/word/2018/wordml/cex" xmlns:w16cid="http://schemas.microsoft.com/office/word/2016/wordml/cid" xmlns:w16="http://schemas.microsoft.com/office/word/2018/wordml" xmlns:w16du="http://schemas.microsoft.com/office/word/2023/wordml/word16du" xmlns:w16sdtdh="http://schemas.microsoft.com/office/word/2020/wordml/sdtdatahash" xmlns:w16sdtfl="http://schemas.microsoft.com/office/word/2024/wordml/sdtformatlock" xmlns:w16se="http://schemas.microsoft.com/office/word/2015/wordml/symex" xmlns:wpg="http://schemas.microsoft.com/office/word/2010/wordprocessingGroup" xmlns:wpi="http://schemas.microsoft.com/office/word/2010/wordprocessingInk" xmlns:wne="http://schemas.microsoft.com/office/word/2006/wordml" xmlns:wps="http://schemas.microsoft.com/office/word/2010/wordprocessingShape" mc:Ignorable="w14 w15 w16se w16cid w16 w16cex w16sdtdh w16sdtfl w16du wp14">
   <w:body>
     <w:p>
       <w:pPr>
@@ -13297,6 +13297,7 @@
             <w:checkBox>
               <w:sizeAuto/>
               <w:default w:val="0"/>
+              <w:checked/>
             </w:checkBox>
           </w:ffData>
         </w:fldChar>
@@ -17744,7 +17745,23 @@
           <w:noProof/>
           <w:lang w:val="en-US"/>
         </w:rPr>
-        <w:t>(ii) Participation is solicited from prolific.com, which is joined by more than 200.000 individuals according to their web-site. A sample of 30-50 participants will be targeted for our study.</w:t>
+        <w:t>(ii) Participation is solicited from prolific.com, which is joined by more than 200</w:t>
+      </w:r>
+      <w:r>
+        <w:rPr>
+          <w:rFonts w:ascii="Arial" w:hAnsi="Arial" w:cs="Arial"/>
+          <w:noProof/>
+          <w:lang w:val="en-US"/>
+        </w:rPr>
+        <w:t>,</w:t>
+      </w:r>
+      <w:r>
+        <w:rPr>
+          <w:rFonts w:ascii="Arial" w:hAnsi="Arial" w:cs="Arial"/>
+          <w:noProof/>
+          <w:lang w:val="en-US"/>
+        </w:rPr>
+        <w:t>000 individuals according to their web-site. A sample of 30-50 participants will be targeted for our study.</w:t>
       </w:r>
     </w:p>
     <w:p>
@@ -19563,7 +19580,71 @@
           <w:noProof/>
           <w:lang w:val="en-US"/>
         </w:rPr>
-        <w:t>GBP 4.5 ($8 CAD) for 30' involvement</w:t>
+        <w:t xml:space="preserve">GBP </w:t>
+      </w:r>
+      <w:r>
+        <w:rPr>
+          <w:rFonts w:ascii="Arial" w:hAnsi="Arial" w:cs="Arial"/>
+          <w:noProof/>
+          <w:lang w:val="en-US"/>
+        </w:rPr>
+        <w:t>6</w:t>
+      </w:r>
+      <w:r>
+        <w:rPr>
+          <w:rFonts w:ascii="Arial" w:hAnsi="Arial" w:cs="Arial"/>
+          <w:noProof/>
+          <w:lang w:val="en-US"/>
+        </w:rPr>
+        <w:t>.</w:t>
+      </w:r>
+      <w:r>
+        <w:rPr>
+          <w:rFonts w:ascii="Arial" w:hAnsi="Arial" w:cs="Arial"/>
+          <w:noProof/>
+          <w:lang w:val="en-US"/>
+        </w:rPr>
+        <w:t>2</w:t>
+      </w:r>
+      <w:r>
+        <w:rPr>
+          <w:rFonts w:ascii="Arial" w:hAnsi="Arial" w:cs="Arial"/>
+          <w:noProof/>
+          <w:lang w:val="en-US"/>
+        </w:rPr>
+        <w:t>5 ($</w:t>
+      </w:r>
+      <w:r>
+        <w:rPr>
+          <w:rFonts w:ascii="Arial" w:hAnsi="Arial" w:cs="Arial"/>
+          <w:noProof/>
+          <w:lang w:val="en-US"/>
+        </w:rPr>
+        <w:t>12</w:t>
+      </w:r>
+      <w:r>
+        <w:rPr>
+          <w:rFonts w:ascii="Arial" w:hAnsi="Arial" w:cs="Arial"/>
+          <w:noProof/>
+          <w:lang w:val="en-US"/>
+        </w:rPr>
+        <w:t xml:space="preserve"> CAD) for </w:t>
+      </w:r>
+      <w:r>
+        <w:rPr>
+          <w:rFonts w:ascii="Arial" w:hAnsi="Arial" w:cs="Arial"/>
+          <w:noProof/>
+          <w:lang w:val="en-US"/>
+        </w:rPr>
+        <w:t>45</w:t>
+      </w:r>
+      <w:r>
+        <w:rPr>
+          <w:rFonts w:ascii="Arial" w:hAnsi="Arial" w:cs="Arial"/>
+          <w:noProof/>
+          <w:lang w:val="en-US"/>
+        </w:rPr>
+        <w:t>' involvement</w:t>
       </w:r>
       <w:r>
         <w:rPr>
@@ -23093,16 +23174,153 @@
         <w:jc w:val="both"/>
         <w:rPr>
           <w:rFonts w:ascii="Arial" w:hAnsi="Arial" w:cs="Arial"/>
-          <w:b/>
-        </w:rPr>
-      </w:pPr>
-      <w:r>
-        <w:rPr>
-          <w:rFonts w:ascii="Arial" w:hAnsi="Arial" w:cs="Arial"/>
           <w:noProof/>
           <w:lang w:val="en-US"/>
         </w:rPr>
-        <w:t xml:space="preserve">(v) A 30 minute involvement is estimated. </w:t>
+      </w:pPr>
+      <w:r>
+        <w:rPr>
+          <w:rFonts w:ascii="Arial" w:hAnsi="Arial" w:cs="Arial"/>
+          <w:noProof/>
+          <w:lang w:val="en-US"/>
+        </w:rPr>
+        <w:t xml:space="preserve">(v) A </w:t>
+      </w:r>
+      <w:r>
+        <w:rPr>
+          <w:rFonts w:ascii="Arial" w:hAnsi="Arial" w:cs="Arial"/>
+          <w:noProof/>
+          <w:lang w:val="en-US"/>
+        </w:rPr>
+        <w:t>45</w:t>
+      </w:r>
+      <w:r>
+        <w:rPr>
+          <w:rFonts w:ascii="Arial" w:hAnsi="Arial" w:cs="Arial"/>
+          <w:noProof/>
+          <w:lang w:val="en-US"/>
+        </w:rPr>
+        <w:t xml:space="preserve"> minute involvement is estimated.</w:t>
+      </w:r>
+    </w:p>
+    <w:p>
+      <w:pPr>
+        <w:pStyle w:val="ListParagraph"/>
+        <w:tabs>
+          <w:tab w:val="left" w:pos="-360"/>
+          <w:tab w:val="left" w:pos="0"/>
+          <w:tab w:val="left" w:pos="1800"/>
+          <w:tab w:val="left" w:pos="2520"/>
+          <w:tab w:val="left" w:pos="3240"/>
+          <w:tab w:val="left" w:pos="3960"/>
+          <w:tab w:val="left" w:pos="4680"/>
+          <w:tab w:val="left" w:pos="5400"/>
+          <w:tab w:val="left" w:pos="6120"/>
+          <w:tab w:val="left" w:pos="6840"/>
+          <w:tab w:val="left" w:pos="7560"/>
+          <w:tab w:val="left" w:pos="8280"/>
+          <w:tab w:val="left" w:pos="9000"/>
+        </w:tabs>
+        <w:ind w:left="810"/>
+        <w:jc w:val="both"/>
+        <w:rPr>
+          <w:rFonts w:ascii="Arial" w:hAnsi="Arial" w:cs="Arial"/>
+          <w:noProof/>
+          <w:lang w:val="en-US"/>
+        </w:rPr>
+      </w:pPr>
+    </w:p>
+    <w:p>
+      <w:pPr>
+        <w:pStyle w:val="ListParagraph"/>
+        <w:tabs>
+          <w:tab w:val="left" w:pos="-360"/>
+          <w:tab w:val="left" w:pos="0"/>
+          <w:tab w:val="left" w:pos="1800"/>
+          <w:tab w:val="left" w:pos="2520"/>
+          <w:tab w:val="left" w:pos="3240"/>
+          <w:tab w:val="left" w:pos="3960"/>
+          <w:tab w:val="left" w:pos="4680"/>
+          <w:tab w:val="left" w:pos="5400"/>
+          <w:tab w:val="left" w:pos="6120"/>
+          <w:tab w:val="left" w:pos="6840"/>
+          <w:tab w:val="left" w:pos="7560"/>
+          <w:tab w:val="left" w:pos="8280"/>
+          <w:tab w:val="left" w:pos="9000"/>
+        </w:tabs>
+        <w:ind w:left="810"/>
+        <w:jc w:val="both"/>
+        <w:rPr>
+          <w:rFonts w:ascii="Arial" w:hAnsi="Arial" w:cs="Arial"/>
+          <w:noProof/>
+          <w:lang w:val="en-US"/>
+        </w:rPr>
+      </w:pPr>
+    </w:p>
+    <w:p>
+      <w:pPr>
+        <w:pStyle w:val="ListParagraph"/>
+        <w:tabs>
+          <w:tab w:val="left" w:pos="-360"/>
+          <w:tab w:val="left" w:pos="0"/>
+          <w:tab w:val="left" w:pos="1800"/>
+          <w:tab w:val="left" w:pos="2520"/>
+          <w:tab w:val="left" w:pos="3240"/>
+          <w:tab w:val="left" w:pos="3960"/>
+          <w:tab w:val="left" w:pos="4680"/>
+          <w:tab w:val="left" w:pos="5400"/>
+          <w:tab w:val="left" w:pos="6120"/>
+          <w:tab w:val="left" w:pos="6840"/>
+          <w:tab w:val="left" w:pos="7560"/>
+          <w:tab w:val="left" w:pos="8280"/>
+          <w:tab w:val="left" w:pos="9000"/>
+        </w:tabs>
+        <w:ind w:left="810"/>
+        <w:jc w:val="both"/>
+        <w:rPr>
+          <w:rFonts w:ascii="Arial" w:hAnsi="Arial" w:cs="Arial"/>
+          <w:b/>
+        </w:rPr>
+      </w:pPr>
+      <w:r>
+        <w:rPr>
+          <w:rFonts w:ascii="Arial" w:hAnsi="Arial" w:cs="Arial"/>
+          <w:noProof/>
+          <w:lang w:val="en-US"/>
+        </w:rPr>
+        <w:t xml:space="preserve">Participants may be </w:t>
+      </w:r>
+      <w:r>
+        <w:rPr>
+          <w:rFonts w:ascii="Arial" w:hAnsi="Arial" w:cs="Arial"/>
+          <w:noProof/>
+          <w:lang w:val="en-US"/>
+        </w:rPr>
+        <w:t xml:space="preserve">randomly selected </w:t>
+      </w:r>
+      <w:r>
+        <w:rPr>
+          <w:rFonts w:ascii="Arial" w:hAnsi="Arial" w:cs="Arial"/>
+          <w:noProof/>
+          <w:lang w:val="en-US"/>
+        </w:rPr>
+        <w:t>to take another session for validation purposes</w:t>
+      </w:r>
+      <w:r>
+        <w:rPr>
+          <w:rFonts w:ascii="Arial" w:hAnsi="Arial" w:cs="Arial"/>
+          <w:noProof/>
+          <w:lang w:val="en-US"/>
+        </w:rPr>
+        <w:t xml:space="preserve"> (test-retest reliability). They will undergo the exact same tasks.</w:t>
+      </w:r>
+      <w:r>
+        <w:rPr>
+          <w:rFonts w:ascii="Arial" w:hAnsi="Arial" w:cs="Arial"/>
+          <w:noProof/>
+          <w:lang w:val="en-US"/>
+        </w:rPr>
+        <w:t xml:space="preserve"> </w:t>
       </w:r>
       <w:r>
         <w:rPr>
@@ -24621,6 +24839,7 @@
         <w:rPr>
           <w:rFonts w:ascii="Arial" w:hAnsi="Arial" w:cs="Arial"/>
         </w:rPr>
+        <w:lastRenderedPageBreak/>
         <w:tab/>
       </w:r>
       <w:r>
@@ -24824,7 +25043,6 @@
           <w:b/>
           <w:lang w:val="en-US"/>
         </w:rPr>
-        <w:lastRenderedPageBreak/>
         <w:t xml:space="preserve">What, if </w:t>
       </w:r>
       <w:proofErr w:type="gramStart"/>
@@ -26514,23 +26732,7 @@
           <w:rFonts w:ascii="Arial" w:hAnsi="Arial" w:cs="Arial"/>
           <w:lang w:val="en-US"/>
         </w:rPr>
-        <w:t xml:space="preserve"> What was the participants’ understanding of the use of the data or materials?  </w:t>
-      </w:r>
-      <w:proofErr w:type="gramStart"/>
-      <w:r>
-        <w:rPr>
-          <w:rFonts w:ascii="Arial" w:hAnsi="Arial" w:cs="Arial"/>
-          <w:lang w:val="en-US"/>
-        </w:rPr>
-        <w:t>Is this understanding</w:t>
-      </w:r>
-      <w:proofErr w:type="gramEnd"/>
-      <w:r>
-        <w:rPr>
-          <w:rFonts w:ascii="Arial" w:hAnsi="Arial" w:cs="Arial"/>
-          <w:lang w:val="en-US"/>
-        </w:rPr>
-        <w:t xml:space="preserve"> consistent with the proposed use?  If not, please explain.  </w:t>
+        <w:t xml:space="preserve"> What was the participants’ understanding of the use of the data or materials?  Is this understanding consistent with the proposed use?  If not, please explain.  </w:t>
       </w:r>
     </w:p>
     <w:p>
@@ -26691,6 +26893,7 @@
         <w:rPr>
           <w:rFonts w:ascii="Arial" w:hAnsi="Arial" w:cs="Arial"/>
         </w:rPr>
+        <w:lastRenderedPageBreak/>
         <w:t xml:space="preserve">Are you using </w:t>
       </w:r>
       <w:r>
@@ -29320,6 +29523,7 @@
           <w:b/>
           <w:bCs/>
         </w:rPr>
+        <w:lastRenderedPageBreak/>
         <w:t>If you checked ‘Yes’ to the previous question</w:t>
       </w:r>
       <w:r>
@@ -29356,14 +29560,7 @@
         <w:rPr>
           <w:rFonts w:ascii="Arial" w:hAnsi="Arial" w:cs="Arial"/>
         </w:rPr>
-        <w:t xml:space="preserve">Please note as per </w:t>
-      </w:r>
-      <w:r>
-        <w:rPr>
-          <w:rFonts w:ascii="Arial" w:hAnsi="Arial" w:cs="Arial"/>
-        </w:rPr>
-        <w:lastRenderedPageBreak/>
-        <w:t>TCPS2 Article 9.20, researchers shall, through community engagement as appropriate, address any potential inadvertent identification of communities, or misuse of traditional knowledge prior to initiating secondary use.</w:t>
+        <w:t>Please note as per TCPS2 Article 9.20, researchers shall, through community engagement as appropriate, address any potential inadvertent identification of communities, or misuse of traditional knowledge prior to initiating secondary use.</w:t>
       </w:r>
     </w:p>
     <w:p>
@@ -31900,7 +32097,6 @@
           <w:rFonts w:ascii="Arial" w:hAnsi="Arial" w:cs="Arial"/>
           <w:b/>
         </w:rPr>
-        <w:lastRenderedPageBreak/>
         <w:t>Is there</w:t>
       </w:r>
       <w:r>
@@ -34143,6 +34339,7 @@
           <w:snapToGrid/>
           <w:lang w:val="en-US"/>
         </w:rPr>
+        <w:lastRenderedPageBreak/>
         <w:t>Researchers must re-obtain consent from the participants once the debriefing statement has been provided.  Participants shall be provided with and sign the “</w:t>
       </w:r>
       <w:hyperlink r:id="rId20" w:tgtFrame="_blank" w:history="1">
@@ -34216,7 +34413,6 @@
           <w:snapToGrid/>
           <w:lang w:val="en-US"/>
         </w:rPr>
-        <w:lastRenderedPageBreak/>
         <w:t xml:space="preserve">If a debriefing statement </w:t>
       </w:r>
       <w:proofErr w:type="gramStart"/>
@@ -36344,7 +36540,16 @@
           <w:noProof/>
           <w:lang w:val="en-US"/>
         </w:rPr>
-        <w:t xml:space="preserve"> the dataset will become available for utilization (secondary data analysis, replications) by the reseach community.</w:t>
+        <w:t xml:space="preserve"> the dataset will become available for </w:t>
+      </w:r>
+      <w:r>
+        <w:rPr>
+          <w:rFonts w:ascii="Arial" w:hAnsi="Arial" w:cs="Arial"/>
+          <w:noProof/>
+          <w:lang w:val="en-US"/>
+        </w:rPr>
+        <w:lastRenderedPageBreak/>
+        <w:t>utilization (secondary data analysis, replications) by the reseach community.</w:t>
       </w:r>
     </w:p>
     <w:p>
@@ -36439,16 +36644,7 @@
           <w:noProof/>
           <w:lang w:val="en-US"/>
         </w:rPr>
-        <w:t xml:space="preserve">which is collected </w:t>
-      </w:r>
-      <w:r>
-        <w:rPr>
-          <w:rFonts w:ascii="Arial" w:hAnsi="Arial" w:cs="Arial"/>
-          <w:noProof/>
-          <w:lang w:val="en-US"/>
-        </w:rPr>
-        <w:lastRenderedPageBreak/>
-        <w:t xml:space="preserve">for the administration of the inducement will be replaced by a internal random ID. In addition, the </w:t>
+        <w:t xml:space="preserve">which is collected for the administration of the inducement will be replaced by a internal random ID. In addition, the </w:t>
       </w:r>
       <w:r>
         <w:rPr>
@@ -37632,24 +37828,8 @@
           <w:noProof/>
           <w:lang w:val="en-US"/>
         </w:rPr>
-        <w:t>Data will be made available in Dataverse and potentially the PIs personal web-page and retained there indefinitelly. The PIs personal web-page contains a list of his publications. The PI may (in addition or instead of a Dataverse entry) upload a CSV file with the data on that server and refer to the file through a hyperlink next to the corresponding publication entry.</w:t>
-      </w:r>
-    </w:p>
-    <w:p>
-      <w:pPr>
-        <w:pStyle w:val="ListParagraph"/>
-        <w:widowControl/>
-        <w:autoSpaceDE w:val="0"/>
-        <w:autoSpaceDN w:val="0"/>
-        <w:adjustRightInd w:val="0"/>
-        <w:ind w:left="810"/>
-        <w:jc w:val="both"/>
-        <w:rPr>
-          <w:rFonts w:ascii="Arial" w:hAnsi="Arial" w:cs="Arial"/>
-          <w:noProof/>
-          <w:lang w:val="en-US"/>
-        </w:rPr>
-      </w:pPr>
+        <w:t>Data will be made available in Dataverse and retained there indefinitelly.</w:t>
+      </w:r>
     </w:p>
     <w:p>
       <w:pPr>
@@ -37799,27 +37979,7 @@
           <w:snapToGrid/>
           <w:lang w:val="en-US"/>
         </w:rPr>
-        <w:t xml:space="preserve">e.g., it is not feasible to de-identify data, there is </w:t>
-      </w:r>
-      <w:proofErr w:type="gramStart"/>
-      <w:r>
-        <w:rPr>
-          <w:rFonts w:ascii="Arial" w:hAnsi="Arial" w:cs="Arial"/>
-          <w:b/>
-          <w:snapToGrid/>
-          <w:lang w:val="en-US"/>
-        </w:rPr>
-        <w:t>a high risk</w:t>
-      </w:r>
-      <w:proofErr w:type="gramEnd"/>
-      <w:r>
-        <w:rPr>
-          <w:rFonts w:ascii="Arial" w:hAnsi="Arial" w:cs="Arial"/>
-          <w:b/>
-          <w:snapToGrid/>
-          <w:lang w:val="en-US"/>
-        </w:rPr>
-        <w:t xml:space="preserve"> of re-identifying or relinking the data, exposure of the data might cause vulnerability or harm to the participants or their communities, the topic of the data is sensitive, etc.</w:t>
+        <w:t>e.g., it is not feasible to de-identify data, there is a high risk of re-identifying or relinking the data, exposure of the data might cause vulnerability or harm to the participants or their communities, the topic of the data is sensitive, etc.</w:t>
       </w:r>
       <w:r>
         <w:rPr>
@@ -37905,7 +38065,6 @@
           <w:snapToGrid/>
           <w:lang w:val="en-US"/>
         </w:rPr>
-        <w:lastRenderedPageBreak/>
         <w:t xml:space="preserve"> </w:t>
       </w:r>
       <w:r>
@@ -38015,6 +38174,7 @@
           <w:snapToGrid/>
           <w:lang w:val="en-US"/>
         </w:rPr>
+        <w:lastRenderedPageBreak/>
         <w:t xml:space="preserve">Provide </w:t>
       </w:r>
       <w:r>
@@ -38929,7 +39089,7 @@
           <w:noProof/>
           <w:lang w:val="en-US"/>
         </w:rPr>
-        <w:t>Written publication and reports, data archive (dataverse, PI's web page).</w:t>
+        <w:t>Written publication and reports, data archive (dataverse).</w:t>
       </w:r>
       <w:r>
         <w:rPr>
@@ -39760,7 +39920,6 @@
             <w:szCs w:val="18"/>
             <w:lang w:val="en-US"/>
           </w:rPr>
-          <w:lastRenderedPageBreak/>
           <w:t>Research Involving Human Participants</w:t>
         </w:r>
       </w:hyperlink>
@@ -39771,7 +39930,17 @@
           <w:szCs w:val="18"/>
           <w:lang w:val="en-US"/>
         </w:rPr>
-        <w:t xml:space="preserve">, and affirm that, to the best of my knowledge, this research conforms thereto. </w:t>
+        <w:t xml:space="preserve">, and affirm that, to the best of my knowledge, this research conforms </w:t>
+      </w:r>
+      <w:r>
+        <w:rPr>
+          <w:rFonts w:ascii="Arial" w:hAnsi="Arial" w:cs="Arial"/>
+          <w:sz w:val="18"/>
+          <w:szCs w:val="18"/>
+          <w:lang w:val="en-US"/>
+        </w:rPr>
+        <w:lastRenderedPageBreak/>
+        <w:t xml:space="preserve">thereto. </w:t>
       </w:r>
       <w:r>
         <w:rPr>
@@ -40919,7 +41088,6 @@
         <w:id w:val="-1855652367"/>
         <w:picture/>
       </w:sdtPr>
-      <w:sdtEndPr/>
       <w:sdtContent>
         <w:p>
           <w:pPr>
@@ -41328,7 +41496,6 @@
         <w:showingPlcHdr/>
         <w:picture/>
       </w:sdtPr>
-      <w:sdtEndPr/>
       <w:sdtContent>
         <w:p>
           <w:pPr>
@@ -41701,7 +41868,7 @@
 </file>
 
 <file path=word/endnotes.xml><?xml version="1.0" encoding="utf-8"?>
-<w:endnotes xmlns:wpc="http://schemas.microsoft.com/office/word/2010/wordprocessingCanvas" xmlns:cx="http://schemas.microsoft.com/office/drawing/2014/chartex" xmlns:cx1="http://schemas.microsoft.com/office/drawing/2015/9/8/chartex" xmlns:cx2="http://schemas.microsoft.com/office/drawing/2015/10/21/chartex" xmlns:cx3="http://schemas.microsoft.com/office/drawing/2016/5/9/chartex" xmlns:cx4="http://schemas.microsoft.com/office/drawing/2016/5/10/chartex" xmlns:cx5="http://schemas.microsoft.com/office/drawing/2016/5/11/chartex" xmlns:cx6="http://schemas.microsoft.com/office/drawing/2016/5/12/chartex" xmlns:cx7="http://schemas.microsoft.com/office/drawing/2016/5/13/chartex" xmlns:cx8="http://schemas.microsoft.com/office/drawing/2016/5/14/chartex" xmlns:mc="http://schemas.openxmlformats.org/markup-compatibility/2006" xmlns:aink="http://schemas.microsoft.com/office/drawing/2016/ink" xmlns:am3d="http://schemas.microsoft.com/office/drawing/2017/model3d" xmlns:o="urn:schemas-microsoft-com:office:office" xmlns:oel="http://schemas.microsoft.com/office/2019/extlst" xmlns:r="http://schemas.openxmlformats.org/officeDocument/2006/relationships" xmlns:m="http://schemas.openxmlformats.org/officeDocument/2006/math" xmlns:v="urn:schemas-microsoft-com:vml" xmlns:wp14="http://schemas.microsoft.com/office/word/2010/wordprocessingDrawing" xmlns:wp="http://schemas.openxmlformats.org/drawingml/2006/wordprocessingDrawing" xmlns:w10="urn:schemas-microsoft-com:office:word" xmlns:w="http://schemas.openxmlformats.org/wordprocessingml/2006/main" xmlns:w14="http://schemas.microsoft.com/office/word/2010/wordml" xmlns:w15="http://schemas.microsoft.com/office/word/2012/wordml" xmlns:w16cex="http://schemas.microsoft.com/office/word/2018/wordml/cex" xmlns:w16cid="http://schemas.microsoft.com/office/word/2016/wordml/cid" xmlns:w16="http://schemas.microsoft.com/office/word/2018/wordml" xmlns:w16du="http://schemas.microsoft.com/office/word/2023/wordml/word16du" xmlns:w16sdtdh="http://schemas.microsoft.com/office/word/2020/wordml/sdtdatahash" xmlns:w16se="http://schemas.microsoft.com/office/word/2015/wordml/symex" xmlns:wpg="http://schemas.microsoft.com/office/word/2010/wordprocessingGroup" xmlns:wpi="http://schemas.microsoft.com/office/word/2010/wordprocessingInk" xmlns:wne="http://schemas.microsoft.com/office/word/2006/wordml" xmlns:wps="http://schemas.microsoft.com/office/word/2010/wordprocessingShape" mc:Ignorable="w14 w15 w16se w16cid w16 w16cex w16sdtdh w16du wp14">
+<w:endnotes xmlns:wpc="http://schemas.microsoft.com/office/word/2010/wordprocessingCanvas" xmlns:cx="http://schemas.microsoft.com/office/drawing/2014/chartex" xmlns:cx1="http://schemas.microsoft.com/office/drawing/2015/9/8/chartex" xmlns:cx2="http://schemas.microsoft.com/office/drawing/2015/10/21/chartex" xmlns:cx3="http://schemas.microsoft.com/office/drawing/2016/5/9/chartex" xmlns:cx4="http://schemas.microsoft.com/office/drawing/2016/5/10/chartex" xmlns:cx5="http://schemas.microsoft.com/office/drawing/2016/5/11/chartex" xmlns:cx6="http://schemas.microsoft.com/office/drawing/2016/5/12/chartex" xmlns:cx7="http://schemas.microsoft.com/office/drawing/2016/5/13/chartex" xmlns:cx8="http://schemas.microsoft.com/office/drawing/2016/5/14/chartex" xmlns:mc="http://schemas.openxmlformats.org/markup-compatibility/2006" xmlns:aink="http://schemas.microsoft.com/office/drawing/2016/ink" xmlns:am3d="http://schemas.microsoft.com/office/drawing/2017/model3d" xmlns:o="urn:schemas-microsoft-com:office:office" xmlns:oel="http://schemas.microsoft.com/office/2019/extlst" xmlns:r="http://schemas.openxmlformats.org/officeDocument/2006/relationships" xmlns:m="http://schemas.openxmlformats.org/officeDocument/2006/math" xmlns:v="urn:schemas-microsoft-com:vml" xmlns:wp14="http://schemas.microsoft.com/office/word/2010/wordprocessingDrawing" xmlns:wp="http://schemas.openxmlformats.org/drawingml/2006/wordprocessingDrawing" xmlns:w10="urn:schemas-microsoft-com:office:word" xmlns:w="http://schemas.openxmlformats.org/wordprocessingml/2006/main" xmlns:w14="http://schemas.microsoft.com/office/word/2010/wordml" xmlns:w15="http://schemas.microsoft.com/office/word/2012/wordml" xmlns:w16cex="http://schemas.microsoft.com/office/word/2018/wordml/cex" xmlns:w16cid="http://schemas.microsoft.com/office/word/2016/wordml/cid" xmlns:w16="http://schemas.microsoft.com/office/word/2018/wordml" xmlns:w16du="http://schemas.microsoft.com/office/word/2023/wordml/word16du" xmlns:w16sdtdh="http://schemas.microsoft.com/office/word/2020/wordml/sdtdatahash" xmlns:w16sdtfl="http://schemas.microsoft.com/office/word/2024/wordml/sdtformatlock" xmlns:w16se="http://schemas.microsoft.com/office/word/2015/wordml/symex" xmlns:wpg="http://schemas.microsoft.com/office/word/2010/wordprocessingGroup" xmlns:wpi="http://schemas.microsoft.com/office/word/2010/wordprocessingInk" xmlns:wne="http://schemas.microsoft.com/office/word/2006/wordml" xmlns:wps="http://schemas.microsoft.com/office/word/2010/wordprocessingShape" mc:Ignorable="w14 w15 w16se w16cid w16 w16cex w16sdtdh w16sdtfl w16du wp14">
   <w:endnote w:type="separator" w:id="-1">
     <w:p>
       <w:r>
@@ -41720,7 +41887,7 @@
 </file>
 
 <file path=word/footer1.xml><?xml version="1.0" encoding="utf-8"?>
-<w:ftr xmlns:wpc="http://schemas.microsoft.com/office/word/2010/wordprocessingCanvas" xmlns:cx="http://schemas.microsoft.com/office/drawing/2014/chartex" xmlns:cx1="http://schemas.microsoft.com/office/drawing/2015/9/8/chartex" xmlns:cx2="http://schemas.microsoft.com/office/drawing/2015/10/21/chartex" xmlns:cx3="http://schemas.microsoft.com/office/drawing/2016/5/9/chartex" xmlns:cx4="http://schemas.microsoft.com/office/drawing/2016/5/10/chartex" xmlns:cx5="http://schemas.microsoft.com/office/drawing/2016/5/11/chartex" xmlns:cx6="http://schemas.microsoft.com/office/drawing/2016/5/12/chartex" xmlns:cx7="http://schemas.microsoft.com/office/drawing/2016/5/13/chartex" xmlns:cx8="http://schemas.microsoft.com/office/drawing/2016/5/14/chartex" xmlns:mc="http://schemas.openxmlformats.org/markup-compatibility/2006" xmlns:aink="http://schemas.microsoft.com/office/drawing/2016/ink" xmlns:am3d="http://schemas.microsoft.com/office/drawing/2017/model3d" xmlns:o="urn:schemas-microsoft-com:office:office" xmlns:oel="http://schemas.microsoft.com/office/2019/extlst" xmlns:r="http://schemas.openxmlformats.org/officeDocument/2006/relationships" xmlns:m="http://schemas.openxmlformats.org/officeDocument/2006/math" xmlns:v="urn:schemas-microsoft-com:vml" xmlns:wp14="http://schemas.microsoft.com/office/word/2010/wordprocessingDrawing" xmlns:wp="http://schemas.openxmlformats.org/drawingml/2006/wordprocessingDrawing" xmlns:w10="urn:schemas-microsoft-com:office:word" xmlns:w="http://schemas.openxmlformats.org/wordprocessingml/2006/main" xmlns:w14="http://schemas.microsoft.com/office/word/2010/wordml" xmlns:w15="http://schemas.microsoft.com/office/word/2012/wordml" xmlns:w16cex="http://schemas.microsoft.com/office/word/2018/wordml/cex" xmlns:w16cid="http://schemas.microsoft.com/office/word/2016/wordml/cid" xmlns:w16="http://schemas.microsoft.com/office/word/2018/wordml" xmlns:w16du="http://schemas.microsoft.com/office/word/2023/wordml/word16du" xmlns:w16sdtdh="http://schemas.microsoft.com/office/word/2020/wordml/sdtdatahash" xmlns:w16se="http://schemas.microsoft.com/office/word/2015/wordml/symex" xmlns:wpg="http://schemas.microsoft.com/office/word/2010/wordprocessingGroup" xmlns:wpi="http://schemas.microsoft.com/office/word/2010/wordprocessingInk" xmlns:wne="http://schemas.microsoft.com/office/word/2006/wordml" xmlns:wps="http://schemas.microsoft.com/office/word/2010/wordprocessingShape" mc:Ignorable="w14 w15 w16se w16cid w16 w16cex w16sdtdh w16du wp14">
+<w:ftr xmlns:wpc="http://schemas.microsoft.com/office/word/2010/wordprocessingCanvas" xmlns:cx="http://schemas.microsoft.com/office/drawing/2014/chartex" xmlns:cx1="http://schemas.microsoft.com/office/drawing/2015/9/8/chartex" xmlns:cx2="http://schemas.microsoft.com/office/drawing/2015/10/21/chartex" xmlns:cx3="http://schemas.microsoft.com/office/drawing/2016/5/9/chartex" xmlns:cx4="http://schemas.microsoft.com/office/drawing/2016/5/10/chartex" xmlns:cx5="http://schemas.microsoft.com/office/drawing/2016/5/11/chartex" xmlns:cx6="http://schemas.microsoft.com/office/drawing/2016/5/12/chartex" xmlns:cx7="http://schemas.microsoft.com/office/drawing/2016/5/13/chartex" xmlns:cx8="http://schemas.microsoft.com/office/drawing/2016/5/14/chartex" xmlns:mc="http://schemas.openxmlformats.org/markup-compatibility/2006" xmlns:aink="http://schemas.microsoft.com/office/drawing/2016/ink" xmlns:am3d="http://schemas.microsoft.com/office/drawing/2017/model3d" xmlns:o="urn:schemas-microsoft-com:office:office" xmlns:oel="http://schemas.microsoft.com/office/2019/extlst" xmlns:r="http://schemas.openxmlformats.org/officeDocument/2006/relationships" xmlns:m="http://schemas.openxmlformats.org/officeDocument/2006/math" xmlns:v="urn:schemas-microsoft-com:vml" xmlns:wp14="http://schemas.microsoft.com/office/word/2010/wordprocessingDrawing" xmlns:wp="http://schemas.openxmlformats.org/drawingml/2006/wordprocessingDrawing" xmlns:w10="urn:schemas-microsoft-com:office:word" xmlns:w="http://schemas.openxmlformats.org/wordprocessingml/2006/main" xmlns:w14="http://schemas.microsoft.com/office/word/2010/wordml" xmlns:w15="http://schemas.microsoft.com/office/word/2012/wordml" xmlns:w16cex="http://schemas.microsoft.com/office/word/2018/wordml/cex" xmlns:w16cid="http://schemas.microsoft.com/office/word/2016/wordml/cid" xmlns:w16="http://schemas.microsoft.com/office/word/2018/wordml" xmlns:w16du="http://schemas.microsoft.com/office/word/2023/wordml/word16du" xmlns:w16sdtdh="http://schemas.microsoft.com/office/word/2020/wordml/sdtdatahash" xmlns:w16sdtfl="http://schemas.microsoft.com/office/word/2024/wordml/sdtformatlock" xmlns:w16se="http://schemas.microsoft.com/office/word/2015/wordml/symex" xmlns:wpg="http://schemas.microsoft.com/office/word/2010/wordprocessingGroup" xmlns:wpi="http://schemas.microsoft.com/office/word/2010/wordprocessingInk" xmlns:wne="http://schemas.microsoft.com/office/word/2006/wordml" xmlns:wps="http://schemas.microsoft.com/office/word/2010/wordprocessingShape" mc:Ignorable="w14 w15 w16se w16cid w16 w16cex w16sdtdh w16sdtfl w16du wp14">
   <w:sdt>
     <w:sdtPr>
       <w:rPr>
@@ -41846,7 +42013,7 @@
 </file>
 
 <file path=word/footnotes.xml><?xml version="1.0" encoding="utf-8"?>
-<w:footnotes xmlns:wpc="http://schemas.microsoft.com/office/word/2010/wordprocessingCanvas" xmlns:cx="http://schemas.microsoft.com/office/drawing/2014/chartex" xmlns:cx1="http://schemas.microsoft.com/office/drawing/2015/9/8/chartex" xmlns:cx2="http://schemas.microsoft.com/office/drawing/2015/10/21/chartex" xmlns:cx3="http://schemas.microsoft.com/office/drawing/2016/5/9/chartex" xmlns:cx4="http://schemas.microsoft.com/office/drawing/2016/5/10/chartex" xmlns:cx5="http://schemas.microsoft.com/office/drawing/2016/5/11/chartex" xmlns:cx6="http://schemas.microsoft.com/office/drawing/2016/5/12/chartex" xmlns:cx7="http://schemas.microsoft.com/office/drawing/2016/5/13/chartex" xmlns:cx8="http://schemas.microsoft.com/office/drawing/2016/5/14/chartex" xmlns:mc="http://schemas.openxmlformats.org/markup-compatibility/2006" xmlns:aink="http://schemas.microsoft.com/office/drawing/2016/ink" xmlns:am3d="http://schemas.microsoft.com/office/drawing/2017/model3d" xmlns:o="urn:schemas-microsoft-com:office:office" xmlns:oel="http://schemas.microsoft.com/office/2019/extlst" xmlns:r="http://schemas.openxmlformats.org/officeDocument/2006/relationships" xmlns:m="http://schemas.openxmlformats.org/officeDocument/2006/math" xmlns:v="urn:schemas-microsoft-com:vml" xmlns:wp14="http://schemas.microsoft.com/office/word/2010/wordprocessingDrawing" xmlns:wp="http://schemas.openxmlformats.org/drawingml/2006/wordprocessingDrawing" xmlns:w10="urn:schemas-microsoft-com:office:word" xmlns:w="http://schemas.openxmlformats.org/wordprocessingml/2006/main" xmlns:w14="http://schemas.microsoft.com/office/word/2010/wordml" xmlns:w15="http://schemas.microsoft.com/office/word/2012/wordml" xmlns:w16cex="http://schemas.microsoft.com/office/word/2018/wordml/cex" xmlns:w16cid="http://schemas.microsoft.com/office/word/2016/wordml/cid" xmlns:w16="http://schemas.microsoft.com/office/word/2018/wordml" xmlns:w16du="http://schemas.microsoft.com/office/word/2023/wordml/word16du" xmlns:w16sdtdh="http://schemas.microsoft.com/office/word/2020/wordml/sdtdatahash" xmlns:w16se="http://schemas.microsoft.com/office/word/2015/wordml/symex" xmlns:wpg="http://schemas.microsoft.com/office/word/2010/wordprocessingGroup" xmlns:wpi="http://schemas.microsoft.com/office/word/2010/wordprocessingInk" xmlns:wne="http://schemas.microsoft.com/office/word/2006/wordml" xmlns:wps="http://schemas.microsoft.com/office/word/2010/wordprocessingShape" mc:Ignorable="w14 w15 w16se w16cid w16 w16cex w16sdtdh w16du wp14">
+<w:footnotes xmlns:wpc="http://schemas.microsoft.com/office/word/2010/wordprocessingCanvas" xmlns:cx="http://schemas.microsoft.com/office/drawing/2014/chartex" xmlns:cx1="http://schemas.microsoft.com/office/drawing/2015/9/8/chartex" xmlns:cx2="http://schemas.microsoft.com/office/drawing/2015/10/21/chartex" xmlns:cx3="http://schemas.microsoft.com/office/drawing/2016/5/9/chartex" xmlns:cx4="http://schemas.microsoft.com/office/drawing/2016/5/10/chartex" xmlns:cx5="http://schemas.microsoft.com/office/drawing/2016/5/11/chartex" xmlns:cx6="http://schemas.microsoft.com/office/drawing/2016/5/12/chartex" xmlns:cx7="http://schemas.microsoft.com/office/drawing/2016/5/13/chartex" xmlns:cx8="http://schemas.microsoft.com/office/drawing/2016/5/14/chartex" xmlns:mc="http://schemas.openxmlformats.org/markup-compatibility/2006" xmlns:aink="http://schemas.microsoft.com/office/drawing/2016/ink" xmlns:am3d="http://schemas.microsoft.com/office/drawing/2017/model3d" xmlns:o="urn:schemas-microsoft-com:office:office" xmlns:oel="http://schemas.microsoft.com/office/2019/extlst" xmlns:r="http://schemas.openxmlformats.org/officeDocument/2006/relationships" xmlns:m="http://schemas.openxmlformats.org/officeDocument/2006/math" xmlns:v="urn:schemas-microsoft-com:vml" xmlns:wp14="http://schemas.microsoft.com/office/word/2010/wordprocessingDrawing" xmlns:wp="http://schemas.openxmlformats.org/drawingml/2006/wordprocessingDrawing" xmlns:w10="urn:schemas-microsoft-com:office:word" xmlns:w="http://schemas.openxmlformats.org/wordprocessingml/2006/main" xmlns:w14="http://schemas.microsoft.com/office/word/2010/wordml" xmlns:w15="http://schemas.microsoft.com/office/word/2012/wordml" xmlns:w16cex="http://schemas.microsoft.com/office/word/2018/wordml/cex" xmlns:w16cid="http://schemas.microsoft.com/office/word/2016/wordml/cid" xmlns:w16="http://schemas.microsoft.com/office/word/2018/wordml" xmlns:w16du="http://schemas.microsoft.com/office/word/2023/wordml/word16du" xmlns:w16sdtdh="http://schemas.microsoft.com/office/word/2020/wordml/sdtdatahash" xmlns:w16sdtfl="http://schemas.microsoft.com/office/word/2024/wordml/sdtformatlock" xmlns:w16se="http://schemas.microsoft.com/office/word/2015/wordml/symex" xmlns:wpg="http://schemas.microsoft.com/office/word/2010/wordprocessingGroup" xmlns:wpi="http://schemas.microsoft.com/office/word/2010/wordprocessingInk" xmlns:wne="http://schemas.microsoft.com/office/word/2006/wordml" xmlns:wps="http://schemas.microsoft.com/office/word/2010/wordprocessingShape" mc:Ignorable="w14 w15 w16se w16cid w16 w16cex w16sdtdh w16sdtfl w16du wp14">
   <w:footnote w:type="separator" w:id="-1">
     <w:p>
       <w:r>
@@ -41865,7 +42032,7 @@
 </file>
 
 <file path=word/numbering.xml><?xml version="1.0" encoding="utf-8"?>
-<w:numbering xmlns:wpc="http://schemas.microsoft.com/office/word/2010/wordprocessingCanvas" xmlns:cx="http://schemas.microsoft.com/office/drawing/2014/chartex" xmlns:cx1="http://schemas.microsoft.com/office/drawing/2015/9/8/chartex" xmlns:cx2="http://schemas.microsoft.com/office/drawing/2015/10/21/chartex" xmlns:cx3="http://schemas.microsoft.com/office/drawing/2016/5/9/chartex" xmlns:cx4="http://schemas.microsoft.com/office/drawing/2016/5/10/chartex" xmlns:cx5="http://schemas.microsoft.com/office/drawing/2016/5/11/chartex" xmlns:cx6="http://schemas.microsoft.com/office/drawing/2016/5/12/chartex" xmlns:cx7="http://schemas.microsoft.com/office/drawing/2016/5/13/chartex" xmlns:cx8="http://schemas.microsoft.com/office/drawing/2016/5/14/chartex" xmlns:mc="http://schemas.openxmlformats.org/markup-compatibility/2006" xmlns:aink="http://schemas.microsoft.com/office/drawing/2016/ink" xmlns:am3d="http://schemas.microsoft.com/office/drawing/2017/model3d" xmlns:o="urn:schemas-microsoft-com:office:office" xmlns:oel="http://schemas.microsoft.com/office/2019/extlst" xmlns:r="http://schemas.openxmlformats.org/officeDocument/2006/relationships" xmlns:m="http://schemas.openxmlformats.org/officeDocument/2006/math" xmlns:v="urn:schemas-microsoft-com:vml" xmlns:wp14="http://schemas.microsoft.com/office/word/2010/wordprocessingDrawing" xmlns:wp="http://schemas.openxmlformats.org/drawingml/2006/wordprocessingDrawing" xmlns:w10="urn:schemas-microsoft-com:office:word" xmlns:w="http://schemas.openxmlformats.org/wordprocessingml/2006/main" xmlns:w14="http://schemas.microsoft.com/office/word/2010/wordml" xmlns:w15="http://schemas.microsoft.com/office/word/2012/wordml" xmlns:w16cex="http://schemas.microsoft.com/office/word/2018/wordml/cex" xmlns:w16cid="http://schemas.microsoft.com/office/word/2016/wordml/cid" xmlns:w16="http://schemas.microsoft.com/office/word/2018/wordml" xmlns:w16du="http://schemas.microsoft.com/office/word/2023/wordml/word16du" xmlns:w16sdtdh="http://schemas.microsoft.com/office/word/2020/wordml/sdtdatahash" xmlns:w16se="http://schemas.microsoft.com/office/word/2015/wordml/symex" xmlns:wpg="http://schemas.microsoft.com/office/word/2010/wordprocessingGroup" xmlns:wpi="http://schemas.microsoft.com/office/word/2010/wordprocessingInk" xmlns:wne="http://schemas.microsoft.com/office/word/2006/wordml" xmlns:wps="http://schemas.microsoft.com/office/word/2010/wordprocessingShape" mc:Ignorable="w14 w15 w16se w16cid w16 w16cex w16sdtdh w16du wp14">
+<w:numbering xmlns:wpc="http://schemas.microsoft.com/office/word/2010/wordprocessingCanvas" xmlns:cx="http://schemas.microsoft.com/office/drawing/2014/chartex" xmlns:cx1="http://schemas.microsoft.com/office/drawing/2015/9/8/chartex" xmlns:cx2="http://schemas.microsoft.com/office/drawing/2015/10/21/chartex" xmlns:cx3="http://schemas.microsoft.com/office/drawing/2016/5/9/chartex" xmlns:cx4="http://schemas.microsoft.com/office/drawing/2016/5/10/chartex" xmlns:cx5="http://schemas.microsoft.com/office/drawing/2016/5/11/chartex" xmlns:cx6="http://schemas.microsoft.com/office/drawing/2016/5/12/chartex" xmlns:cx7="http://schemas.microsoft.com/office/drawing/2016/5/13/chartex" xmlns:cx8="http://schemas.microsoft.com/office/drawing/2016/5/14/chartex" xmlns:mc="http://schemas.openxmlformats.org/markup-compatibility/2006" xmlns:aink="http://schemas.microsoft.com/office/drawing/2016/ink" xmlns:am3d="http://schemas.microsoft.com/office/drawing/2017/model3d" xmlns:o="urn:schemas-microsoft-com:office:office" xmlns:oel="http://schemas.microsoft.com/office/2019/extlst" xmlns:r="http://schemas.openxmlformats.org/officeDocument/2006/relationships" xmlns:m="http://schemas.openxmlformats.org/officeDocument/2006/math" xmlns:v="urn:schemas-microsoft-com:vml" xmlns:wp14="http://schemas.microsoft.com/office/word/2010/wordprocessingDrawing" xmlns:wp="http://schemas.openxmlformats.org/drawingml/2006/wordprocessingDrawing" xmlns:w10="urn:schemas-microsoft-com:office:word" xmlns:w="http://schemas.openxmlformats.org/wordprocessingml/2006/main" xmlns:w14="http://schemas.microsoft.com/office/word/2010/wordml" xmlns:w15="http://schemas.microsoft.com/office/word/2012/wordml" xmlns:w16cex="http://schemas.microsoft.com/office/word/2018/wordml/cex" xmlns:w16cid="http://schemas.microsoft.com/office/word/2016/wordml/cid" xmlns:w16="http://schemas.microsoft.com/office/word/2018/wordml" xmlns:w16du="http://schemas.microsoft.com/office/word/2023/wordml/word16du" xmlns:w16sdtdh="http://schemas.microsoft.com/office/word/2020/wordml/sdtdatahash" xmlns:w16sdtfl="http://schemas.microsoft.com/office/word/2024/wordml/sdtformatlock" xmlns:w16se="http://schemas.microsoft.com/office/word/2015/wordml/symex" xmlns:wpg="http://schemas.microsoft.com/office/word/2010/wordprocessingGroup" xmlns:wpi="http://schemas.microsoft.com/office/word/2010/wordprocessingInk" xmlns:wne="http://schemas.microsoft.com/office/word/2006/wordml" xmlns:wps="http://schemas.microsoft.com/office/word/2010/wordprocessingShape" mc:Ignorable="w14 w15 w16se w16cid w16 w16cex w16sdtdh w16sdtfl w16du wp14">
   <w:abstractNum w:abstractNumId="0" w15:restartNumberingAfterBreak="0">
     <w:nsid w:val="02B91D6D"/>
     <w:multiLevelType w:val="hybridMultilevel"/>
@@ -46114,7 +46281,7 @@
 </file>
 
 <file path=word/people.xml><?xml version="1.0" encoding="utf-8"?>
-<w15:people xmlns:wpc="http://schemas.microsoft.com/office/word/2010/wordprocessingCanvas" xmlns:cx="http://schemas.microsoft.com/office/drawing/2014/chartex" xmlns:cx1="http://schemas.microsoft.com/office/drawing/2015/9/8/chartex" xmlns:cx2="http://schemas.microsoft.com/office/drawing/2015/10/21/chartex" xmlns:cx3="http://schemas.microsoft.com/office/drawing/2016/5/9/chartex" xmlns:cx4="http://schemas.microsoft.com/office/drawing/2016/5/10/chartex" xmlns:cx5="http://schemas.microsoft.com/office/drawing/2016/5/11/chartex" xmlns:cx6="http://schemas.microsoft.com/office/drawing/2016/5/12/chartex" xmlns:cx7="http://schemas.microsoft.com/office/drawing/2016/5/13/chartex" xmlns:cx8="http://schemas.microsoft.com/office/drawing/2016/5/14/chartex" xmlns:mc="http://schemas.openxmlformats.org/markup-compatibility/2006" xmlns:aink="http://schemas.microsoft.com/office/drawing/2016/ink" xmlns:am3d="http://schemas.microsoft.com/office/drawing/2017/model3d" xmlns:o="urn:schemas-microsoft-com:office:office" xmlns:oel="http://schemas.microsoft.com/office/2019/extlst" xmlns:r="http://schemas.openxmlformats.org/officeDocument/2006/relationships" xmlns:m="http://schemas.openxmlformats.org/officeDocument/2006/math" xmlns:v="urn:schemas-microsoft-com:vml" xmlns:wp14="http://schemas.microsoft.com/office/word/2010/wordprocessingDrawing" xmlns:wp="http://schemas.openxmlformats.org/drawingml/2006/wordprocessingDrawing" xmlns:w10="urn:schemas-microsoft-com:office:word" xmlns:w="http://schemas.openxmlformats.org/wordprocessingml/2006/main" xmlns:w14="http://schemas.microsoft.com/office/word/2010/wordml" xmlns:w15="http://schemas.microsoft.com/office/word/2012/wordml" xmlns:w16cex="http://schemas.microsoft.com/office/word/2018/wordml/cex" xmlns:w16cid="http://schemas.microsoft.com/office/word/2016/wordml/cid" xmlns:w16="http://schemas.microsoft.com/office/word/2018/wordml" xmlns:w16du="http://schemas.microsoft.com/office/word/2023/wordml/word16du" xmlns:w16sdtdh="http://schemas.microsoft.com/office/word/2020/wordml/sdtdatahash" xmlns:w16se="http://schemas.microsoft.com/office/word/2015/wordml/symex" xmlns:wpg="http://schemas.microsoft.com/office/word/2010/wordprocessingGroup" xmlns:wpi="http://schemas.microsoft.com/office/word/2010/wordprocessingInk" xmlns:wne="http://schemas.microsoft.com/office/word/2006/wordml" xmlns:wps="http://schemas.microsoft.com/office/word/2010/wordprocessingShape" mc:Ignorable="w14 w15 w16se w16cid w16 w16cex w16sdtdh w16du wp14">
+<w15:people xmlns:wpc="http://schemas.microsoft.com/office/word/2010/wordprocessingCanvas" xmlns:cx="http://schemas.microsoft.com/office/drawing/2014/chartex" xmlns:cx1="http://schemas.microsoft.com/office/drawing/2015/9/8/chartex" xmlns:cx2="http://schemas.microsoft.com/office/drawing/2015/10/21/chartex" xmlns:cx3="http://schemas.microsoft.com/office/drawing/2016/5/9/chartex" xmlns:cx4="http://schemas.microsoft.com/office/drawing/2016/5/10/chartex" xmlns:cx5="http://schemas.microsoft.com/office/drawing/2016/5/11/chartex" xmlns:cx6="http://schemas.microsoft.com/office/drawing/2016/5/12/chartex" xmlns:cx7="http://schemas.microsoft.com/office/drawing/2016/5/13/chartex" xmlns:cx8="http://schemas.microsoft.com/office/drawing/2016/5/14/chartex" xmlns:mc="http://schemas.openxmlformats.org/markup-compatibility/2006" xmlns:aink="http://schemas.microsoft.com/office/drawing/2016/ink" xmlns:am3d="http://schemas.microsoft.com/office/drawing/2017/model3d" xmlns:o="urn:schemas-microsoft-com:office:office" xmlns:oel="http://schemas.microsoft.com/office/2019/extlst" xmlns:r="http://schemas.openxmlformats.org/officeDocument/2006/relationships" xmlns:m="http://schemas.openxmlformats.org/officeDocument/2006/math" xmlns:v="urn:schemas-microsoft-com:vml" xmlns:wp14="http://schemas.microsoft.com/office/word/2010/wordprocessingDrawing" xmlns:wp="http://schemas.openxmlformats.org/drawingml/2006/wordprocessingDrawing" xmlns:w10="urn:schemas-microsoft-com:office:word" xmlns:w="http://schemas.openxmlformats.org/wordprocessingml/2006/main" xmlns:w14="http://schemas.microsoft.com/office/word/2010/wordml" xmlns:w15="http://schemas.microsoft.com/office/word/2012/wordml" xmlns:w16cex="http://schemas.microsoft.com/office/word/2018/wordml/cex" xmlns:w16cid="http://schemas.microsoft.com/office/word/2016/wordml/cid" xmlns:w16="http://schemas.microsoft.com/office/word/2018/wordml" xmlns:w16du="http://schemas.microsoft.com/office/word/2023/wordml/word16du" xmlns:w16sdtdh="http://schemas.microsoft.com/office/word/2020/wordml/sdtdatahash" xmlns:w16sdtfl="http://schemas.microsoft.com/office/word/2024/wordml/sdtformatlock" xmlns:w16se="http://schemas.microsoft.com/office/word/2015/wordml/symex" xmlns:wpg="http://schemas.microsoft.com/office/word/2010/wordprocessingGroup" xmlns:wpi="http://schemas.microsoft.com/office/word/2010/wordprocessingInk" xmlns:wne="http://schemas.microsoft.com/office/word/2006/wordml" xmlns:wps="http://schemas.microsoft.com/office/word/2010/wordprocessingShape" mc:Ignorable="w14 w15 w16se w16cid w16 w16cex w16sdtdh w16sdtfl w16du wp14">
   <w15:person w15:author="Sotirios Liaskos">
     <w15:presenceInfo w15:providerId="AD" w15:userId="S::liaskos@yorku.ca::74e5c40c-e896-4b15-8a08-4b8215dacd27"/>
   </w15:person>
@@ -46122,7 +46289,7 @@
 </file>
 
 <file path=word/styles.xml><?xml version="1.0" encoding="utf-8"?>
-<w:styles xmlns:mc="http://schemas.openxmlformats.org/markup-compatibility/2006" xmlns:r="http://schemas.openxmlformats.org/officeDocument/2006/relationships" xmlns:w="http://schemas.openxmlformats.org/wordprocessingml/2006/main" xmlns:w14="http://schemas.microsoft.com/office/word/2010/wordml" xmlns:w15="http://schemas.microsoft.com/office/word/2012/wordml" xmlns:w16cex="http://schemas.microsoft.com/office/word/2018/wordml/cex" xmlns:w16cid="http://schemas.microsoft.com/office/word/2016/wordml/cid" xmlns:w16="http://schemas.microsoft.com/office/word/2018/wordml" xmlns:w16du="http://schemas.microsoft.com/office/word/2023/wordml/word16du" xmlns:w16sdtdh="http://schemas.microsoft.com/office/word/2020/wordml/sdtdatahash" xmlns:w16se="http://schemas.microsoft.com/office/word/2015/wordml/symex" mc:Ignorable="w14 w15 w16se w16cid w16 w16cex w16sdtdh w16du">
+<w:styles xmlns:mc="http://schemas.openxmlformats.org/markup-compatibility/2006" xmlns:r="http://schemas.openxmlformats.org/officeDocument/2006/relationships" xmlns:w="http://schemas.openxmlformats.org/wordprocessingml/2006/main" xmlns:w14="http://schemas.microsoft.com/office/word/2010/wordml" xmlns:w15="http://schemas.microsoft.com/office/word/2012/wordml" xmlns:w16cex="http://schemas.microsoft.com/office/word/2018/wordml/cex" xmlns:w16cid="http://schemas.microsoft.com/office/word/2016/wordml/cid" xmlns:w16="http://schemas.microsoft.com/office/word/2018/wordml" xmlns:w16du="http://schemas.microsoft.com/office/word/2023/wordml/word16du" xmlns:w16sdtdh="http://schemas.microsoft.com/office/word/2020/wordml/sdtdatahash" xmlns:w16sdtfl="http://schemas.microsoft.com/office/word/2024/wordml/sdtformatlock" xmlns:w16se="http://schemas.microsoft.com/office/word/2015/wordml/symex" mc:Ignorable="w14 w15 w16se w16cid w16 w16cex w16sdtdh w16sdtfl w16du">
   <w:docDefaults>
     <w:rPrDefault>
       <w:rPr>

</xml_diff>